<commit_message>
feat: implement core application modules, API endpoints, mobile screens, and test suites
</commit_message>
<xml_diff>
--- a/docs/academic/presentations/ArogyaRakshak_Project_Abstract.docx
+++ b/docs/academic/presentations/ArogyaRakshak_Project_Abstract.docx
@@ -13,7 +13,6 @@
           <w:szCs w:val="32"/>
         </w:rPr>
       </w:pPr>
-      <w:proofErr w:type="spellStart"/>
       <w:r>
         <w:rPr>
           <w:b/>
@@ -23,7 +22,6 @@
         </w:rPr>
         <w:t>ArogyaRakshak</w:t>
       </w:r>
-      <w:proofErr w:type="spellEnd"/>
       <w:r>
         <w:rPr>
           <w:b/>
@@ -193,19 +191,8 @@
           <w:sz w:val="24"/>
           <w:szCs w:val="24"/>
         </w:rPr>
-        <w:t xml:space="preserve">Sanjali </w:t>
-      </w:r>
-      <w:proofErr w:type="spellStart"/>
-      <w:r>
-        <w:rPr>
-          <w:b/>
-          <w:bCs/>
-          <w:sz w:val="24"/>
-          <w:szCs w:val="24"/>
-        </w:rPr>
-        <w:t>Paygude</w:t>
-      </w:r>
-      <w:proofErr w:type="spellEnd"/>
+        <w:t>Sanjali Paygude</w:t>
+      </w:r>
     </w:p>
     <w:p>
       <w:pPr>
@@ -320,7 +307,25 @@
           <w:sz w:val="24"/>
           <w:szCs w:val="24"/>
         </w:rPr>
-        <w:t>Under the guidance of Prof. Deepali V. Gore</w:t>
+        <w:t>Under the guidance of Prof. De</w:t>
+      </w:r>
+      <w:r>
+        <w:rPr>
+          <w:i/>
+          <w:iCs/>
+          <w:sz w:val="24"/>
+          <w:szCs w:val="24"/>
+        </w:rPr>
+        <w:t>i</w:t>
+      </w:r>
+      <w:r>
+        <w:rPr>
+          <w:i/>
+          <w:iCs/>
+          <w:sz w:val="24"/>
+          <w:szCs w:val="24"/>
+        </w:rPr>
+        <w:t>pali V. Gore</w:t>
       </w:r>
     </w:p>
     <w:p>
@@ -346,23 +351,7 @@
           <w:sz w:val="24"/>
           <w:szCs w:val="24"/>
         </w:rPr>
-        <w:t xml:space="preserve">Healthcare Decision Support, Multi-Agent LLM Systems, Retrieval-Augmented Generation (RAG), Optical Character Recognition (OCR), Indic / Cross-Lingual NLP, Health Insurance Regulation (IRDAI), Government Welfare Schemes (PMJAY/MJPJAY), </w:t>
-      </w:r>
-      <w:proofErr w:type="spellStart"/>
-      <w:r>
-        <w:rPr>
-          <w:sz w:val="24"/>
-          <w:szCs w:val="24"/>
-        </w:rPr>
-        <w:t>FastAPI</w:t>
-      </w:r>
-      <w:proofErr w:type="spellEnd"/>
-      <w:r>
-        <w:rPr>
-          <w:sz w:val="24"/>
-          <w:szCs w:val="24"/>
-        </w:rPr>
-        <w:t>, Next.js</w:t>
+        <w:t>Healthcare Decision Support, Multi-Agent LLM Systems, Retrieval-Augmented Generation (RAG), Optical Character Recognition (OCR), Indic / Cross-Lingual NLP, Health Insurance Regulation (IRDAI), Government Welfare Schemes (PMJAY/MJPJAY), FastAPI, Next.js</w:t>
       </w:r>
     </w:p>
     <w:p>
@@ -401,55 +390,7 @@
           <w:sz w:val="24"/>
           <w:szCs w:val="24"/>
         </w:rPr>
-        <w:t>Patients discharged from Indian hospitals routinely face four compounding sources of financial and administrative friction: (</w:t>
-      </w:r>
-      <w:proofErr w:type="spellStart"/>
-      <w:r>
-        <w:rPr>
-          <w:sz w:val="24"/>
-          <w:szCs w:val="24"/>
-        </w:rPr>
-        <w:t>i</w:t>
-      </w:r>
-      <w:proofErr w:type="spellEnd"/>
-      <w:r>
-        <w:rPr>
-          <w:sz w:val="24"/>
-          <w:szCs w:val="24"/>
-        </w:rPr>
-        <w:t xml:space="preserve">) itemised hospital bills that overcharge against published Central Government Health Scheme (CGHS) benchmark rates; (ii) health-insurance claims that are wrongfully repudiated by citing clauses such as the pre-existing-condition moratorium even when regulatory conditions for such denial are not met; (iii) low awareness of entitlements under national and state welfare schemes such as PMJAY and MJPJAY; and (iv) branded medicines purchased at retail MRP when NPPA price-controlled generic equivalents exist at Jan </w:t>
-      </w:r>
-      <w:proofErr w:type="spellStart"/>
-      <w:r>
-        <w:rPr>
-          <w:sz w:val="24"/>
-          <w:szCs w:val="24"/>
-        </w:rPr>
-        <w:t>Aushadhi</w:t>
-      </w:r>
-      <w:proofErr w:type="spellEnd"/>
-      <w:r>
-        <w:rPr>
-          <w:sz w:val="24"/>
-          <w:szCs w:val="24"/>
-        </w:rPr>
-        <w:t xml:space="preserve"> </w:t>
-      </w:r>
-      <w:proofErr w:type="spellStart"/>
-      <w:r>
-        <w:rPr>
-          <w:sz w:val="24"/>
-          <w:szCs w:val="24"/>
-        </w:rPr>
-        <w:t>Kendras</w:t>
-      </w:r>
-      <w:proofErr w:type="spellEnd"/>
-      <w:r>
-        <w:rPr>
-          <w:sz w:val="24"/>
-          <w:szCs w:val="24"/>
-        </w:rPr>
-        <w:t xml:space="preserve"> for a fraction of the cost. Each of these problems has historically been addressed, if at all, by isolated tools or manual advocacy. There is a need for a single, patient-facing platform that can read a patient's own documents once and surface actionable guidance across all four problem areas, in the patient's own language.</w:t>
+        <w:t>Patients discharged from Indian hospitals routinely face four compounding sources of financial and administrative friction: (i) itemised hospital bills that overcharge against published Central Government Health Scheme (CGHS) benchmark rates; (ii) health-insurance claims that are wrongfully repudiated by citing clauses such as the pre-existing-condition moratorium even when regulatory conditions for such denial are not met; (iii) low awareness of entitlements under national and state welfare schemes such as PMJAY and MJPJAY; and (iv) branded medicines purchased at retail MRP when NPPA price-controlled generic equivalents exist at Jan Aushadhi Kendras for a fraction of the cost. Each of these problems has historically been addressed, if at all, by isolated tools or manual advocacy. There is a need for a single, patient-facing platform that can read a patient's own documents once and surface actionable guidance across all four problem areas, in the patient's own language.</w:t>
       </w:r>
     </w:p>
     <w:p>
@@ -569,39 +510,7 @@
           <w:sz w:val="24"/>
           <w:szCs w:val="24"/>
         </w:rPr>
-        <w:t>Multilingual OCR: The shared Kadi layer runs OCR (</w:t>
-      </w:r>
-      <w:proofErr w:type="spellStart"/>
-      <w:r>
-        <w:rPr>
-          <w:sz w:val="24"/>
-          <w:szCs w:val="24"/>
-        </w:rPr>
-        <w:t>EasyOCR</w:t>
-      </w:r>
-      <w:proofErr w:type="spellEnd"/>
-      <w:r>
-        <w:rPr>
-          <w:sz w:val="24"/>
-          <w:szCs w:val="24"/>
-        </w:rPr>
-        <w:t xml:space="preserve"> / </w:t>
-      </w:r>
-      <w:proofErr w:type="spellStart"/>
-      <w:r>
-        <w:rPr>
-          <w:sz w:val="24"/>
-          <w:szCs w:val="24"/>
-        </w:rPr>
-        <w:t>PyMuPDF</w:t>
-      </w:r>
-      <w:proofErr w:type="spellEnd"/>
-      <w:r>
-        <w:rPr>
-          <w:sz w:val="24"/>
-          <w:szCs w:val="24"/>
-        </w:rPr>
-        <w:t>) capable of reading Devanagari and Latin-script text from scanned images and PDFs.</w:t>
+        <w:t>Multilingual OCR: The shared Kadi layer runs OCR (EasyOCR / PyMuPDF) capable of reading Devanagari and Latin-script text from scanned images and PDFs.</w:t>
       </w:r>
     </w:p>
     <w:p>
@@ -623,39 +532,7 @@
           <w:sz w:val="24"/>
           <w:szCs w:val="24"/>
         </w:rPr>
-        <w:t xml:space="preserve">Entity Extraction &amp; Normalisation: Extracted text is passed to a </w:t>
-      </w:r>
-      <w:proofErr w:type="spellStart"/>
-      <w:r>
-        <w:rPr>
-          <w:sz w:val="24"/>
-          <w:szCs w:val="24"/>
-        </w:rPr>
-        <w:t>Groq</w:t>
-      </w:r>
-      <w:proofErr w:type="spellEnd"/>
-      <w:r>
-        <w:rPr>
-          <w:sz w:val="24"/>
-          <w:szCs w:val="24"/>
-        </w:rPr>
-        <w:t>-hosted LLM (</w:t>
-      </w:r>
-      <w:proofErr w:type="spellStart"/>
-      <w:r>
-        <w:rPr>
-          <w:sz w:val="24"/>
-          <w:szCs w:val="24"/>
-        </w:rPr>
-        <w:t>openai</w:t>
-      </w:r>
-      <w:proofErr w:type="spellEnd"/>
-      <w:r>
-        <w:rPr>
-          <w:sz w:val="24"/>
-          <w:szCs w:val="24"/>
-        </w:rPr>
-        <w:t>/gpt-oss-120b), with a deterministic regex/heuristic fallback, to normalise patient, hospital, diagnosis, procedure, medicine, and billing line-item entities into a shared JSON schema, persisted against a consent-gated case session.</w:t>
+        <w:t>Entity Extraction &amp; Normalisation: Extracted text is passed to a Groq-hosted LLM (openai/gpt-oss-120b), with a deterministic regex/heuristic fallback, to normalise patient, hospital, diagnosis, procedure, medicine, and billing line-item entities into a shared JSON schema, persisted against a consent-gated case session.</w:t>
       </w:r>
     </w:p>
     <w:p>
@@ -677,39 +554,7 @@
           <w:sz w:val="24"/>
           <w:szCs w:val="24"/>
         </w:rPr>
-        <w:t>Cross-Module Context Sharing: Once a patient opts in, the same extracted entities are made available to every downstream module via Kadi's FAISS-backed in-memory vector store, avoiding repeated uploads. Kadi's design additionally specifies phonetic transliteration (</w:t>
-      </w:r>
-      <w:proofErr w:type="spellStart"/>
-      <w:r>
-        <w:rPr>
-          <w:sz w:val="24"/>
-          <w:szCs w:val="24"/>
-        </w:rPr>
-        <w:t>IndicXlit</w:t>
-      </w:r>
-      <w:proofErr w:type="spellEnd"/>
-      <w:r>
-        <w:rPr>
-          <w:sz w:val="24"/>
-          <w:szCs w:val="24"/>
-        </w:rPr>
-        <w:t>) and cross-lingual semantic embedding (</w:t>
-      </w:r>
-      <w:proofErr w:type="spellStart"/>
-      <w:r>
-        <w:rPr>
-          <w:sz w:val="24"/>
-          <w:szCs w:val="24"/>
-        </w:rPr>
-        <w:t>IndicSBERT</w:t>
-      </w:r>
-      <w:proofErr w:type="spellEnd"/>
-      <w:r>
-        <w:rPr>
-          <w:sz w:val="24"/>
-          <w:szCs w:val="24"/>
-        </w:rPr>
-        <w:t>) scoring to resolve the same entity written in different scripts or languages; this combined resolution pipeline is the platform's next planned development milestone and is not yet wired into the running system.</w:t>
+        <w:t>Cross-Module Context Sharing: Once a patient opts in, the same extracted entities are made available to every downstream module via Kadi's FAISS-backed in-memory vector store, avoiding repeated uploads. Kadi's design additionally specifies phonetic transliteration (IndicXlit) and cross-lingual semantic embedding (IndicSBERT) scoring to resolve the same entity written in different scripts or languages; this combined resolution pipeline is the platform's next planned development milestone and is not yet wired into the running system.</w:t>
       </w:r>
     </w:p>
     <w:p>
@@ -731,71 +576,7 @@
           <w:sz w:val="24"/>
           <w:szCs w:val="24"/>
         </w:rPr>
-        <w:t xml:space="preserve">Domain-Specific Multi-Agent / RAG Reasoning: The relevant module runs its own reasoning chain grounded in a public government reference source — </w:t>
-      </w:r>
-      <w:proofErr w:type="spellStart"/>
-      <w:r>
-        <w:rPr>
-          <w:sz w:val="24"/>
-          <w:szCs w:val="24"/>
-        </w:rPr>
-        <w:t>BillNyay's</w:t>
-      </w:r>
-      <w:proofErr w:type="spellEnd"/>
-      <w:r>
-        <w:rPr>
-          <w:sz w:val="24"/>
-          <w:szCs w:val="24"/>
-        </w:rPr>
-        <w:t xml:space="preserve"> 5-agent chain (Document Auditor → Clinical Reviewer → Regulatory Advisor → Appeal Drafter → QA Judge) audits bills against CGHS rates; </w:t>
-      </w:r>
-      <w:proofErr w:type="spellStart"/>
-      <w:r>
-        <w:rPr>
-          <w:sz w:val="24"/>
-          <w:szCs w:val="24"/>
-        </w:rPr>
-        <w:t>BimaNyay</w:t>
-      </w:r>
-      <w:proofErr w:type="spellEnd"/>
-      <w:r>
-        <w:rPr>
-          <w:sz w:val="24"/>
-          <w:szCs w:val="24"/>
-        </w:rPr>
-        <w:t xml:space="preserve"> audits denial letters against the IRDAI Master Circular (29 May 2024); </w:t>
-      </w:r>
-      <w:proofErr w:type="spellStart"/>
-      <w:r>
-        <w:rPr>
-          <w:sz w:val="24"/>
-          <w:szCs w:val="24"/>
-        </w:rPr>
-        <w:t>SchemeSetu</w:t>
-      </w:r>
-      <w:proofErr w:type="spellEnd"/>
-      <w:r>
-        <w:rPr>
-          <w:sz w:val="24"/>
-          <w:szCs w:val="24"/>
-        </w:rPr>
-        <w:t xml:space="preserve"> reasons over PMJAY/MJPJAY eligibility rules; </w:t>
-      </w:r>
-      <w:proofErr w:type="spellStart"/>
-      <w:r>
-        <w:rPr>
-          <w:sz w:val="24"/>
-          <w:szCs w:val="24"/>
-        </w:rPr>
-        <w:t>DawaCheck</w:t>
-      </w:r>
-      <w:proofErr w:type="spellEnd"/>
-      <w:r>
-        <w:rPr>
-          <w:sz w:val="24"/>
-          <w:szCs w:val="24"/>
-        </w:rPr>
-        <w:t xml:space="preserve"> benchmarks </w:t>
+        <w:t xml:space="preserve">Domain-Specific Multi-Agent / RAG Reasoning: The relevant module runs its own reasoning chain grounded in a public government reference source — BillNyay's 5-agent chain (Document Auditor → Clinical Reviewer → Regulatory Advisor → Appeal Drafter → QA Judge) audits bills against CGHS rates; BimaNyay audits denial letters against the IRDAI Master Circular (29 May 2024); SchemeSetu reasons over PMJAY/MJPJAY eligibility rules; DawaCheck benchmarks </w:t>
       </w:r>
       <w:r>
         <w:rPr>
@@ -803,23 +584,7 @@
           <w:szCs w:val="24"/>
         </w:rPr>
         <w:lastRenderedPageBreak/>
-        <w:t xml:space="preserve">MRP against NPPA Schedule-I ceiling prices; </w:t>
-      </w:r>
-      <w:proofErr w:type="spellStart"/>
-      <w:r>
-        <w:rPr>
-          <w:sz w:val="24"/>
-          <w:szCs w:val="24"/>
-        </w:rPr>
-        <w:t>DaaviSetu</w:t>
-      </w:r>
-      <w:proofErr w:type="spellEnd"/>
-      <w:r>
-        <w:rPr>
-          <w:sz w:val="24"/>
-          <w:szCs w:val="24"/>
-        </w:rPr>
-        <w:t xml:space="preserve"> assembles pre-authorisation/claim packages.</w:t>
+        <w:t>MRP against NPPA Schedule-I ceiling prices; DaaviSetu assembles pre-authorisation/claim packages.</w:t>
       </w:r>
     </w:p>
     <w:p>
@@ -841,23 +606,7 @@
           <w:sz w:val="24"/>
           <w:szCs w:val="24"/>
         </w:rPr>
-        <w:t xml:space="preserve">Real-Time Progress Streaming: A </w:t>
-      </w:r>
-      <w:proofErr w:type="spellStart"/>
-      <w:r>
-        <w:rPr>
-          <w:sz w:val="24"/>
-          <w:szCs w:val="24"/>
-        </w:rPr>
-        <w:t>FastAPI</w:t>
-      </w:r>
-      <w:proofErr w:type="spellEnd"/>
-      <w:r>
-        <w:rPr>
-          <w:sz w:val="24"/>
-          <w:szCs w:val="24"/>
-        </w:rPr>
-        <w:t xml:space="preserve"> Server-Sent Events (SSE) channel streams pipeline stage progress (document received → OCR → extraction → domain audit → completed) to the client during processing.</w:t>
+        <w:t>Real-Time Progress Streaming: A FastAPI Server-Sent Events (SSE) channel streams pipeline stage progress (document received → OCR → extraction → domain audit → completed) to the client during processing.</w:t>
       </w:r>
     </w:p>
     <w:p>
@@ -879,39 +628,7 @@
           <w:sz w:val="24"/>
           <w:szCs w:val="24"/>
         </w:rPr>
-        <w:t xml:space="preserve">Output Generation: The system returns a structured audit report, a drafted appeal/dispute letter (PDF, via </w:t>
-      </w:r>
-      <w:proofErr w:type="spellStart"/>
-      <w:r>
-        <w:rPr>
-          <w:sz w:val="24"/>
-          <w:szCs w:val="24"/>
-        </w:rPr>
-        <w:t>ReportLab</w:t>
-      </w:r>
-      <w:proofErr w:type="spellEnd"/>
-      <w:r>
-        <w:rPr>
-          <w:sz w:val="24"/>
-          <w:szCs w:val="24"/>
-        </w:rPr>
-        <w:t xml:space="preserve">), a claim/pre-authorisation form, an eligibility verdict with a step-by-step claim guide, or a price/generic comparison, depending on the module invoked — rendered </w:t>
-      </w:r>
-      <w:proofErr w:type="spellStart"/>
-      <w:r>
-        <w:rPr>
-          <w:sz w:val="24"/>
-          <w:szCs w:val="24"/>
-        </w:rPr>
-        <w:t>trilingually</w:t>
-      </w:r>
-      <w:proofErr w:type="spellEnd"/>
-      <w:r>
-        <w:rPr>
-          <w:sz w:val="24"/>
-          <w:szCs w:val="24"/>
-        </w:rPr>
-        <w:t xml:space="preserve"> where the module supports it.</w:t>
+        <w:t>Output Generation: The system returns a structured audit report, a drafted appeal/dispute letter (PDF, via ReportLab), a claim/pre-authorisation form, an eligibility verdict with a step-by-step claim guide, or a price/generic comparison, depending on the module invoked — rendered trilingually where the module supports it.</w:t>
       </w:r>
     </w:p>
     <w:p>
@@ -925,6 +642,7 @@
       </w:pPr>
       <w:r>
         <w:rPr>
+          <w:noProof/>
           <w:sz w:val="24"/>
           <w:szCs w:val="24"/>
         </w:rPr>
@@ -1025,71 +743,7 @@
           <w:sz w:val="24"/>
           <w:szCs w:val="24"/>
         </w:rPr>
-        <w:t>CGHS rate schedules (</w:t>
-      </w:r>
-      <w:proofErr w:type="spellStart"/>
-      <w:r>
-        <w:rPr>
-          <w:sz w:val="24"/>
-          <w:szCs w:val="24"/>
-        </w:rPr>
-        <w:t>BillNyay</w:t>
-      </w:r>
-      <w:proofErr w:type="spellEnd"/>
-      <w:r>
-        <w:rPr>
-          <w:sz w:val="24"/>
-          <w:szCs w:val="24"/>
-        </w:rPr>
-        <w:t>); NPPA Schedule-I ceiling price orders (</w:t>
-      </w:r>
-      <w:proofErr w:type="spellStart"/>
-      <w:r>
-        <w:rPr>
-          <w:sz w:val="24"/>
-          <w:szCs w:val="24"/>
-        </w:rPr>
-        <w:t>DawaCheck</w:t>
-      </w:r>
-      <w:proofErr w:type="spellEnd"/>
-      <w:r>
-        <w:rPr>
-          <w:sz w:val="24"/>
-          <w:szCs w:val="24"/>
-        </w:rPr>
-        <w:t>); PMJAY (national) and MJPJAY (Maharashtra) scheme rules (</w:t>
-      </w:r>
-      <w:proofErr w:type="spellStart"/>
-      <w:r>
-        <w:rPr>
-          <w:sz w:val="24"/>
-          <w:szCs w:val="24"/>
-        </w:rPr>
-        <w:t>SchemeSetu</w:t>
-      </w:r>
-      <w:proofErr w:type="spellEnd"/>
-      <w:r>
-        <w:rPr>
-          <w:sz w:val="24"/>
-          <w:szCs w:val="24"/>
-        </w:rPr>
-        <w:t>); IRDAI Master Circular, 29 May 2024, and Insurance Ombudsman Rules, 2017 (</w:t>
-      </w:r>
-      <w:proofErr w:type="spellStart"/>
-      <w:r>
-        <w:rPr>
-          <w:sz w:val="24"/>
-          <w:szCs w:val="24"/>
-        </w:rPr>
-        <w:t>BimaNyay</w:t>
-      </w:r>
-      <w:proofErr w:type="spellEnd"/>
-      <w:r>
-        <w:rPr>
-          <w:sz w:val="24"/>
-          <w:szCs w:val="24"/>
-        </w:rPr>
-        <w:t>)</w:t>
+        <w:t>CGHS rate schedules (BillNyay); NPPA Schedule-I ceiling price orders (DawaCheck); PMJAY (national) and MJPJAY (Maharashtra) scheme rules (SchemeSetu); IRDAI Master Circular, 29 May 2024, and Insurance Ombudsman Rules, 2017 (BimaNyay)</w:t>
       </w:r>
     </w:p>
     <w:p>
@@ -1245,21 +899,12 @@
           <w:szCs w:val="24"/>
         </w:rPr>
       </w:pPr>
-      <w:proofErr w:type="spellStart"/>
-      <w:r>
-        <w:rPr>
-          <w:sz w:val="24"/>
-          <w:szCs w:val="24"/>
-        </w:rPr>
-        <w:t>BillNyay</w:t>
-      </w:r>
-      <w:proofErr w:type="spellEnd"/>
-      <w:r>
-        <w:rPr>
-          <w:sz w:val="24"/>
-          <w:szCs w:val="24"/>
-        </w:rPr>
-        <w:t xml:space="preserve"> — 5-agent hospital bill audit vs. CGHS rates</w:t>
+      <w:r>
+        <w:rPr>
+          <w:sz w:val="24"/>
+          <w:szCs w:val="24"/>
+        </w:rPr>
+        <w:t>BillNyay — 5-agent hospital bill audit vs. CGHS rates</w:t>
       </w:r>
     </w:p>
     <w:p>
@@ -1276,21 +921,12 @@
           <w:szCs w:val="24"/>
         </w:rPr>
       </w:pPr>
-      <w:proofErr w:type="spellStart"/>
-      <w:r>
-        <w:rPr>
-          <w:sz w:val="24"/>
-          <w:szCs w:val="24"/>
-        </w:rPr>
-        <w:t>DaaviSetu</w:t>
-      </w:r>
-      <w:proofErr w:type="spellEnd"/>
-      <w:r>
-        <w:rPr>
-          <w:sz w:val="24"/>
-          <w:szCs w:val="24"/>
-        </w:rPr>
-        <w:t xml:space="preserve"> — pre-claim cashless pre-authorisation / reimbursement form automation</w:t>
+      <w:r>
+        <w:rPr>
+          <w:sz w:val="24"/>
+          <w:szCs w:val="24"/>
+        </w:rPr>
+        <w:t>DaaviSetu — pre-claim cashless pre-authorisation / reimbursement form automation</w:t>
       </w:r>
     </w:p>
     <w:p>
@@ -1307,21 +943,12 @@
           <w:szCs w:val="24"/>
         </w:rPr>
       </w:pPr>
-      <w:proofErr w:type="spellStart"/>
-      <w:r>
-        <w:rPr>
-          <w:sz w:val="24"/>
-          <w:szCs w:val="24"/>
-        </w:rPr>
-        <w:t>BimaNyay</w:t>
-      </w:r>
-      <w:proofErr w:type="spellEnd"/>
-      <w:r>
-        <w:rPr>
-          <w:sz w:val="24"/>
-          <w:szCs w:val="24"/>
-        </w:rPr>
-        <w:t xml:space="preserve"> — post-denial IRDAI regulatory audit and 3-tier statutory appeal drafting with SLA tracking</w:t>
+      <w:r>
+        <w:rPr>
+          <w:sz w:val="24"/>
+          <w:szCs w:val="24"/>
+        </w:rPr>
+        <w:t>BimaNyay — post-denial IRDAI regulatory audit and 3-tier statutory appeal drafting with SLA tracking</w:t>
       </w:r>
     </w:p>
     <w:p>
@@ -1338,21 +965,12 @@
           <w:szCs w:val="24"/>
         </w:rPr>
       </w:pPr>
-      <w:proofErr w:type="spellStart"/>
-      <w:r>
-        <w:rPr>
-          <w:sz w:val="24"/>
-          <w:szCs w:val="24"/>
-        </w:rPr>
-        <w:t>SchemeSetu</w:t>
-      </w:r>
-      <w:proofErr w:type="spellEnd"/>
-      <w:r>
-        <w:rPr>
-          <w:sz w:val="24"/>
-          <w:szCs w:val="24"/>
-        </w:rPr>
-        <w:t xml:space="preserve"> — PMJAY/MJPJAY eligibility reasoning with an offline embedding fallback</w:t>
+      <w:r>
+        <w:rPr>
+          <w:sz w:val="24"/>
+          <w:szCs w:val="24"/>
+        </w:rPr>
+        <w:t>SchemeSetu — PMJAY/MJPJAY eligibility reasoning with an offline embedding fallback</w:t>
       </w:r>
     </w:p>
     <w:p>
@@ -1369,21 +987,12 @@
           <w:szCs w:val="24"/>
         </w:rPr>
       </w:pPr>
-      <w:proofErr w:type="spellStart"/>
-      <w:r>
-        <w:rPr>
-          <w:sz w:val="24"/>
-          <w:szCs w:val="24"/>
-        </w:rPr>
-        <w:t>DawaCheck</w:t>
-      </w:r>
-      <w:proofErr w:type="spellEnd"/>
-      <w:r>
-        <w:rPr>
-          <w:sz w:val="24"/>
-          <w:szCs w:val="24"/>
-        </w:rPr>
-        <w:t xml:space="preserve"> — NPPA Schedule-I price verification and Jan Aushadhi generic substitution</w:t>
+      <w:r>
+        <w:rPr>
+          <w:sz w:val="24"/>
+          <w:szCs w:val="24"/>
+        </w:rPr>
+        <w:t>DawaCheck — NPPA Schedule-I price verification and Jan Aushadhi generic substitution</w:t>
       </w:r>
     </w:p>
     <w:p>
@@ -1405,71 +1014,7 @@
           <w:sz w:val="24"/>
           <w:szCs w:val="24"/>
         </w:rPr>
-        <w:t xml:space="preserve">Platform: </w:t>
-      </w:r>
-      <w:proofErr w:type="spellStart"/>
-      <w:r>
-        <w:rPr>
-          <w:sz w:val="24"/>
-          <w:szCs w:val="24"/>
-        </w:rPr>
-        <w:t>FastAPI</w:t>
-      </w:r>
-      <w:proofErr w:type="spellEnd"/>
-      <w:r>
-        <w:rPr>
-          <w:sz w:val="24"/>
-          <w:szCs w:val="24"/>
-        </w:rPr>
-        <w:t xml:space="preserve"> (async) · PostgreSQL 16 + </w:t>
-      </w:r>
-      <w:proofErr w:type="spellStart"/>
-      <w:r>
-        <w:rPr>
-          <w:sz w:val="24"/>
-          <w:szCs w:val="24"/>
-        </w:rPr>
-        <w:t>pgvector</w:t>
-      </w:r>
-      <w:proofErr w:type="spellEnd"/>
-      <w:r>
-        <w:rPr>
-          <w:sz w:val="24"/>
-          <w:szCs w:val="24"/>
-        </w:rPr>
-        <w:t xml:space="preserve"> · FAISS · </w:t>
-      </w:r>
-      <w:proofErr w:type="spellStart"/>
-      <w:r>
-        <w:rPr>
-          <w:sz w:val="24"/>
-          <w:szCs w:val="24"/>
-        </w:rPr>
-        <w:t>Groq</w:t>
-      </w:r>
-      <w:proofErr w:type="spellEnd"/>
-      <w:r>
-        <w:rPr>
-          <w:sz w:val="24"/>
-          <w:szCs w:val="24"/>
-        </w:rPr>
-        <w:t xml:space="preserve"> Cloud LLM inference · Next.js 16 / React 19 web </w:t>
-      </w:r>
-      <w:proofErr w:type="gramStart"/>
-      <w:r>
-        <w:rPr>
-          <w:sz w:val="24"/>
-          <w:szCs w:val="24"/>
-        </w:rPr>
-        <w:t>client</w:t>
-      </w:r>
-      <w:proofErr w:type="gramEnd"/>
-      <w:r>
-        <w:rPr>
-          <w:sz w:val="24"/>
-          <w:szCs w:val="24"/>
-        </w:rPr>
-        <w:t xml:space="preserve"> · React Native + Expo mobile client · Docker Compose</w:t>
+        <w:t>Platform: FastAPI (async) · PostgreSQL 16 + pgvector · FAISS · Groq Cloud LLM inference · Next.js 16 / React 19 web client · React Native + Expo mobile client · Docker Compose</w:t>
       </w:r>
     </w:p>
     <w:p>
@@ -1675,69 +1220,12 @@
           <w:szCs w:val="24"/>
         </w:rPr>
       </w:pPr>
-      <w:proofErr w:type="spellStart"/>
-      <w:r>
-        <w:rPr>
-          <w:sz w:val="24"/>
-          <w:szCs w:val="24"/>
-        </w:rPr>
-        <w:t>Rahulprasath</w:t>
-      </w:r>
-      <w:proofErr w:type="spellEnd"/>
-      <w:r>
-        <w:rPr>
-          <w:sz w:val="24"/>
-          <w:szCs w:val="24"/>
-        </w:rPr>
-        <w:t xml:space="preserve"> S., Pranav Harshan S., Kabilash P. V., </w:t>
-      </w:r>
-      <w:proofErr w:type="spellStart"/>
-      <w:r>
-        <w:rPr>
-          <w:sz w:val="24"/>
-          <w:szCs w:val="24"/>
-        </w:rPr>
-        <w:t>Lakshithraj</w:t>
-      </w:r>
-      <w:proofErr w:type="spellEnd"/>
-      <w:r>
-        <w:rPr>
-          <w:sz w:val="24"/>
-          <w:szCs w:val="24"/>
-        </w:rPr>
-        <w:t xml:space="preserve"> A., and </w:t>
-      </w:r>
-      <w:proofErr w:type="spellStart"/>
-      <w:r>
-        <w:rPr>
-          <w:sz w:val="24"/>
-          <w:szCs w:val="24"/>
-        </w:rPr>
-        <w:t>Sreemathy</w:t>
-      </w:r>
-      <w:proofErr w:type="spellEnd"/>
-      <w:r>
-        <w:rPr>
-          <w:sz w:val="24"/>
-          <w:szCs w:val="24"/>
-        </w:rPr>
-        <w:t xml:space="preserve"> J., “AI in Healthcare: Simplifying Medical Reports for Enhanced Patient Comprehension,” in Proc. 2025 Int. Conf. on Emerging Technologies in Computing and Communication (ETCC), Bangalore, India, 2025, </w:t>
-      </w:r>
-      <w:proofErr w:type="spellStart"/>
-      <w:r>
-        <w:rPr>
-          <w:sz w:val="24"/>
-          <w:szCs w:val="24"/>
-        </w:rPr>
-        <w:t>doi</w:t>
-      </w:r>
-      <w:proofErr w:type="spellEnd"/>
-      <w:r>
-        <w:rPr>
-          <w:sz w:val="24"/>
-          <w:szCs w:val="24"/>
-        </w:rPr>
-        <w:t>: 10.1109/ETCC65847.2025.11108371.</w:t>
+      <w:r>
+        <w:rPr>
+          <w:sz w:val="24"/>
+          <w:szCs w:val="24"/>
+        </w:rPr>
+        <w:t>Rahulprasath S., Pranav Harshan S., Kabilash P. V., Lakshithraj A., and Sreemathy J., “AI in Healthcare: Simplifying Medical Reports for Enhanced Patient Comprehension,” in Proc. 2025 Int. Conf. on Emerging Technologies in Computing and Communication (ETCC), Bangalore, India, 2025, doi: 10.1109/ETCC65847.2025.11108371.</w:t>
       </w:r>
     </w:p>
     <w:p>
@@ -1759,39 +1247,7 @@
           <w:sz w:val="24"/>
           <w:szCs w:val="24"/>
         </w:rPr>
-        <w:t>K. Madhani et al., “</w:t>
-      </w:r>
-      <w:proofErr w:type="spellStart"/>
-      <w:r>
-        <w:rPr>
-          <w:sz w:val="24"/>
-          <w:szCs w:val="24"/>
-        </w:rPr>
-        <w:t>Aksharantar</w:t>
-      </w:r>
-      <w:proofErr w:type="spellEnd"/>
-      <w:r>
-        <w:rPr>
-          <w:sz w:val="24"/>
-          <w:szCs w:val="24"/>
-        </w:rPr>
-        <w:t xml:space="preserve">: Towards Building Open Transliteration Tools for the Next Billion Users,” </w:t>
-      </w:r>
-      <w:proofErr w:type="spellStart"/>
-      <w:r>
-        <w:rPr>
-          <w:sz w:val="24"/>
-          <w:szCs w:val="24"/>
-        </w:rPr>
-        <w:t>arXiv</w:t>
-      </w:r>
-      <w:proofErr w:type="spellEnd"/>
-      <w:r>
-        <w:rPr>
-          <w:sz w:val="24"/>
-          <w:szCs w:val="24"/>
-        </w:rPr>
-        <w:t xml:space="preserve"> preprint, 2022.</w:t>
+        <w:t>K. Madhani et al., “Aksharantar: Towards Building Open Transliteration Tools for the Next Billion Users,” arXiv preprint, 2022.</w:t>
       </w:r>
     </w:p>
     <w:p>
@@ -1813,23 +1269,7 @@
           <w:sz w:val="24"/>
           <w:szCs w:val="24"/>
         </w:rPr>
-        <w:t xml:space="preserve">R. </w:t>
-      </w:r>
-      <w:proofErr w:type="spellStart"/>
-      <w:r>
-        <w:rPr>
-          <w:sz w:val="24"/>
-          <w:szCs w:val="24"/>
-        </w:rPr>
-        <w:t>Litake</w:t>
-      </w:r>
-      <w:proofErr w:type="spellEnd"/>
-      <w:r>
-        <w:rPr>
-          <w:sz w:val="24"/>
-          <w:szCs w:val="24"/>
-        </w:rPr>
-        <w:t xml:space="preserve"> et al., “L3Cube-MahaNER: A Marathi Named Entity Recognition Dataset and BERT Models,” in Proc. WILDRE-6 Workshop, LREC 2022.</w:t>
+        <w:t>R. Litake et al., “L3Cube-MahaNER: A Marathi Named Entity Recognition Dataset and BERT Models,” in Proc. WILDRE-6 Workshop, LREC 2022.</w:t>
       </w:r>
     </w:p>
     <w:p>

</xml_diff>